<commit_message>
Epic 2 - Alina Kravets
</commit_message>
<xml_diff>
--- a/epic_2/epic_2_report_alina_kravets.docx
+++ b/epic_2/epic_2_report_alina_kravets.docx
@@ -2870,9 +2870,9 @@
         </w:rPr>
         <w:lastRenderedPageBreak/>
         <w:drawing>
-          <wp:inline distT="0" distB="0" distL="0" distR="0" wp14:anchorId="6B4EEF95" wp14:editId="25083673">
-            <wp:extent cx="4854361" cy="5730737"/>
-            <wp:effectExtent l="0" t="0" r="3810" b="3810"/>
+          <wp:inline distT="0" distB="0" distL="0" distR="0" wp14:anchorId="6B4EEF95" wp14:editId="6B1438E3">
+            <wp:extent cx="4677846" cy="5730737"/>
+            <wp:effectExtent l="0" t="0" r="8890" b="3810"/>
             <wp:docPr id="31" name="Picture 31"/>
             <wp:cNvGraphicFramePr>
               <a:graphicFrameLocks xmlns:a="http://schemas.openxmlformats.org/drawingml/2006/main" noChangeAspect="1"/>
@@ -2899,7 +2899,7 @@
                   <pic:spPr>
                     <a:xfrm>
                       <a:off x="0" y="0"/>
-                      <a:ext cx="4854361" cy="5730737"/>
+                      <a:ext cx="4677846" cy="5730737"/>
                     </a:xfrm>
                     <a:prstGeom prst="rect">
                       <a:avLst/>
@@ -2937,9 +2937,9 @@
         </w:rPr>
         <w:lastRenderedPageBreak/>
         <w:drawing>
-          <wp:inline distT="0" distB="0" distL="0" distR="0" wp14:anchorId="3F53D837" wp14:editId="6ECA02C8">
-            <wp:extent cx="4808637" cy="6035563"/>
-            <wp:effectExtent l="0" t="0" r="0" b="3810"/>
+          <wp:inline distT="0" distB="0" distL="0" distR="0" wp14:anchorId="3F53D837" wp14:editId="6AD177F1">
+            <wp:extent cx="4503420" cy="4338660"/>
+            <wp:effectExtent l="0" t="0" r="0" b="5080"/>
             <wp:docPr id="32" name="Picture 32"/>
             <wp:cNvGraphicFramePr>
               <a:graphicFrameLocks xmlns:a="http://schemas.openxmlformats.org/drawingml/2006/main" noChangeAspect="1"/>
@@ -2966,7 +2966,7 @@
                   <pic:spPr>
                     <a:xfrm>
                       <a:off x="0" y="0"/>
-                      <a:ext cx="4808637" cy="6035563"/>
+                      <a:ext cx="4511704" cy="4346641"/>
                     </a:xfrm>
                     <a:prstGeom prst="rect">
                       <a:avLst/>
@@ -3002,11 +3002,10 @@
           <w:noProof/>
           <w:lang w:val="en-US"/>
         </w:rPr>
-        <w:lastRenderedPageBreak/>
         <w:drawing>
-          <wp:inline distT="0" distB="0" distL="0" distR="0" wp14:anchorId="0FE1DA3E" wp14:editId="3E978E57">
-            <wp:extent cx="3596952" cy="6066046"/>
-            <wp:effectExtent l="0" t="0" r="3810" b="0"/>
+          <wp:inline distT="0" distB="0" distL="0" distR="0" wp14:anchorId="0FE1DA3E" wp14:editId="07B595A4">
+            <wp:extent cx="4112191" cy="3558540"/>
+            <wp:effectExtent l="0" t="0" r="3175" b="3810"/>
             <wp:docPr id="33" name="Picture 33"/>
             <wp:cNvGraphicFramePr>
               <a:graphicFrameLocks xmlns:a="http://schemas.openxmlformats.org/drawingml/2006/main" noChangeAspect="1"/>
@@ -3033,7 +3032,7 @@
                   <pic:spPr>
                     <a:xfrm>
                       <a:off x="0" y="0"/>
-                      <a:ext cx="3596952" cy="6066046"/>
+                      <a:ext cx="4112191" cy="3558540"/>
                     </a:xfrm>
                     <a:prstGeom prst="rect">
                       <a:avLst/>
@@ -3071,9 +3070,9 @@
         </w:rPr>
         <w:lastRenderedPageBreak/>
         <w:drawing>
-          <wp:inline distT="0" distB="0" distL="0" distR="0" wp14:anchorId="0A0A5741" wp14:editId="0701617E">
-            <wp:extent cx="5731510" cy="4309110"/>
-            <wp:effectExtent l="0" t="0" r="2540" b="0"/>
+          <wp:inline distT="0" distB="0" distL="0" distR="0" wp14:anchorId="0A0A5741" wp14:editId="6E057AC0">
+            <wp:extent cx="5692351" cy="4309110"/>
+            <wp:effectExtent l="0" t="0" r="3810" b="0"/>
             <wp:docPr id="34" name="Picture 34"/>
             <wp:cNvGraphicFramePr>
               <a:graphicFrameLocks xmlns:a="http://schemas.openxmlformats.org/drawingml/2006/main" noChangeAspect="1"/>
@@ -3100,7 +3099,7 @@
                   <pic:spPr>
                     <a:xfrm>
                       <a:off x="0" y="0"/>
-                      <a:ext cx="5731510" cy="4309110"/>
+                      <a:ext cx="5692351" cy="4309110"/>
                     </a:xfrm>
                     <a:prstGeom prst="rect">
                       <a:avLst/>
@@ -3402,7 +3401,7 @@
       <w:r>
         <w:t xml:space="preserve">: </w:t>
       </w:r>
-      <w:hyperlink r:id="rId18" w:history="1">
+      <w:hyperlink r:id="rId18" w:anchor="diff-d212070077330b8aac82acd168377d1b4953c4b7e5cd594b5eda65e157468159" w:history="1">
         <w:r>
           <w:rPr>
             <w:rStyle w:val="Hyperlink"/>
@@ -3506,10 +3505,7 @@
         <w:t>:</w:t>
       </w:r>
       <w:r>
-        <w:t xml:space="preserve"> </w:t>
-      </w:r>
-      <w:r>
-        <w:t>https://github.com/artificial-intelligence-department/ai_programming_playground_2026/pull/271/changes#diff-05041a7dfccf093d6a4a9fe436bff76eb569b03c8db6443876ce9173c713945c</w:t>
+        <w:t xml:space="preserve"> https://github.com/artificial-intelligence-department/ai_programming_playground_2026/pull/271/changes#diff-05041a7dfccf093d6a4a9fe436bff76eb569b03c8db6443876ce9173c713945c</w:t>
       </w:r>
     </w:p>
     <w:p>
@@ -10196,6 +10192,7 @@
   <w:style w:type="character" w:default="1" w:styleId="DefaultParagraphFont">
     <w:name w:val="Default Paragraph Font"/>
     <w:uiPriority w:val="1"/>
+    <w:semiHidden/>
     <w:unhideWhenUsed/>
   </w:style>
   <w:style w:type="table" w:default="1" w:styleId="TableNormal">

</xml_diff>